<commit_message>
Please provide the diff or list of changes you would like summarized.
</commit_message>
<xml_diff>
--- a/iuh/môn/hkh-4/dinhTuyenChuyenMach/lab/lab2/lab2-LeThanhLong.docx
+++ b/iuh/môn/hkh-4/dinhTuyenChuyenMach/lab/lab2/lab2-LeThanhLong.docx
@@ -1682,6 +1682,100 @@
         <w:rPr>
           <w:sz w:val="26"/>
           <w:szCs w:val="26"/>
+          <w:lang w:val="vi-VN"/>
+        </w:rPr>
+      </w:pPr>
+    </w:p>
+    <w:p>
+      <w:pPr>
+        <w:rPr>
+          <w:lang w:val="vi-VN"/>
+        </w:rPr>
+      </w:pPr>
+      <w:proofErr w:type="spellStart"/>
+      <w:r>
+        <w:t>Bài</w:t>
+      </w:r>
+      <w:proofErr w:type="spellEnd"/>
+      <w:r>
+        <w:rPr>
+          <w:lang w:val="vi-VN"/>
+        </w:rPr>
+        <w:t xml:space="preserve"> 1 </w:t>
+      </w:r>
+    </w:p>
+    <w:p>
+      <w:pPr>
+        <w:rPr>
+          <w:lang w:val="vi-VN"/>
+        </w:rPr>
+      </w:pPr>
+      <w:r>
+        <w:rPr>
+          <w:lang w:val="vi-VN"/>
+        </w:rPr>
+        <w:t>Bài 2</w:t>
+      </w:r>
+    </w:p>
+    <w:p>
+      <w:pPr>
+        <w:rPr>
+          <w:lang w:val="vi-VN"/>
+        </w:rPr>
+      </w:pPr>
+      <w:proofErr w:type="spellStart"/>
+      <w:r>
+        <w:t>Bài</w:t>
+      </w:r>
+      <w:proofErr w:type="spellEnd"/>
+      <w:r>
+        <w:rPr>
+          <w:lang w:val="vi-VN"/>
+        </w:rPr>
+        <w:t xml:space="preserve"> </w:t>
+      </w:r>
+      <w:r>
+        <w:rPr>
+          <w:lang w:val="vi-VN"/>
+        </w:rPr>
+        <w:t>3</w:t>
+      </w:r>
+    </w:p>
+    <w:p>
+      <w:pPr>
+        <w:rPr>
+          <w:lang w:val="vi-VN"/>
+        </w:rPr>
+      </w:pPr>
+      <w:r>
+        <w:rPr>
+          <w:lang w:val="vi-VN"/>
+        </w:rPr>
+        <w:t xml:space="preserve">Bài </w:t>
+      </w:r>
+      <w:r>
+        <w:rPr>
+          <w:lang w:val="vi-VN"/>
+        </w:rPr>
+        <w:t>4</w:t>
+      </w:r>
+    </w:p>
+    <w:p>
+      <w:pPr>
+        <w:rPr>
+          <w:lang w:val="vi-VN"/>
+        </w:rPr>
+      </w:pPr>
+      <w:r>
+        <w:rPr>
+          <w:lang w:val="vi-VN"/>
+        </w:rPr>
+        <w:t>Bài 5</w:t>
+      </w:r>
+    </w:p>
+    <w:p>
+      <w:pPr>
+        <w:rPr>
           <w:lang w:val="vi-VN"/>
         </w:rPr>
       </w:pPr>

</xml_diff>